<commit_message>
9, 25.03 fixes 7.03 compline fix
</commit_message>
<xml_diff>
--- a/flow/20230927_hours/drafts/2025-03-g/01.03.docx
+++ b/flow/20230927_hours/drafts/2025-03-g/01.03.docx
@@ -4402,110 +4402,23 @@
       </w:r>
     </w:p>
     <w:p>
-      <w:r>
-        <w:rPr>
-          <w:rFonts w:ascii="Times New Roman" w:hAnsi="Times New Roman"/>
-          <w:i/>
-          <w:color w:val="FF0000"/>
-          <w:sz w:val="24"/>
-        </w:rPr>
-        <w:t>Тропар (г. 8):</w:t>
-      </w:r>
-      <w:r>
-        <w:rPr>
-          <w:rFonts w:ascii="Times New Roman" w:hAnsi="Times New Roman"/>
-          <w:color w:val="000000"/>
-          <w:sz w:val="24"/>
-        </w:rPr>
-        <w:t xml:space="preserve"> Правильністю розумною душу твою прив’язала єси до любові Христової,</w:t>
-      </w:r>
-      <w:r>
-        <w:rPr>
-          <w:rFonts w:ascii="Times New Roman" w:hAnsi="Times New Roman"/>
-          <w:sz w:val="24"/>
-          <w:highlight w:val="white"/>
-        </w:rPr>
-        <w:t>*</w:t>
-      </w:r>
-      <w:r>
-        <w:rPr>
-          <w:rFonts w:ascii="Times New Roman" w:hAnsi="Times New Roman"/>
-          <w:color w:val="000000"/>
-          <w:sz w:val="24"/>
-        </w:rPr>
-        <w:t xml:space="preserve"> тлінне, гарне, дочасне забуттям пробігла єси як учениця Слова. Перше постом пристрасті умертвила,</w:t>
-      </w:r>
-      <w:r>
-        <w:rPr>
-          <w:rFonts w:ascii="Times New Roman" w:hAnsi="Times New Roman"/>
-          <w:sz w:val="24"/>
-          <w:highlight w:val="white"/>
-        </w:rPr>
-        <w:t>*</w:t>
-      </w:r>
-      <w:r>
-        <w:rPr>
-          <w:rFonts w:ascii="Times New Roman" w:hAnsi="Times New Roman"/>
-          <w:color w:val="000000"/>
-          <w:sz w:val="24"/>
-        </w:rPr>
-        <w:t xml:space="preserve"> а відтак стражданням ворога осоромила,</w:t>
-      </w:r>
-      <w:r>
-        <w:rPr>
-          <w:rFonts w:ascii="Times New Roman" w:hAnsi="Times New Roman"/>
-          <w:sz w:val="24"/>
-          <w:highlight w:val="white"/>
-        </w:rPr>
-        <w:t>*</w:t>
-      </w:r>
-      <w:r>
-        <w:rPr>
-          <w:rFonts w:ascii="Times New Roman" w:hAnsi="Times New Roman"/>
-          <w:color w:val="000000"/>
-          <w:sz w:val="24"/>
-        </w:rPr>
-        <w:t xml:space="preserve"> тому Христос подвійних вінців сподобив тебе,</w:t>
-      </w:r>
-      <w:r>
-        <w:rPr>
-          <w:rFonts w:ascii="Times New Roman" w:hAnsi="Times New Roman"/>
-          <w:sz w:val="24"/>
-          <w:highlight w:val="white"/>
-        </w:rPr>
-        <w:t>*</w:t>
-      </w:r>
-      <w:r>
-        <w:rPr>
-          <w:rFonts w:ascii="Times New Roman" w:hAnsi="Times New Roman"/>
-          <w:color w:val="000000"/>
-          <w:sz w:val="24"/>
-        </w:rPr>
-        <w:t xml:space="preserve"> Євдокіє славна, страстотерпице преподобна,</w:t>
-      </w:r>
-      <w:r>
-        <w:rPr>
-          <w:rFonts w:ascii="Times New Roman" w:hAnsi="Times New Roman"/>
-          <w:sz w:val="24"/>
-          <w:highlight w:val="white"/>
-        </w:rPr>
-        <w:t>*</w:t>
-      </w:r>
-      <w:r>
-        <w:rPr>
-          <w:rFonts w:ascii="Times New Roman" w:hAnsi="Times New Roman"/>
-          <w:color w:val="000000"/>
-          <w:sz w:val="24"/>
-        </w:rPr>
-        <w:t xml:space="preserve"> моли ж Христа, щоб спаслис</w:t>
-      </w:r>
-      <w:r>
-        <w:rPr>
-          <w:rFonts w:ascii="Times New Roman" w:hAnsi="Times New Roman"/>
-          <w:color w:val="000000"/>
-          <w:sz w:val="24"/>
-        </w:rPr>
-        <w:t>ь душі наші.</w:t>
+      <w:pPr>
+        <w:spacing w:line="240" w:lineRule="auto"/>
+        <w:rPr>
+          <w:rFonts w:ascii="Times New Roman" w:hAnsi="Times New Roman"/>
+          <w:i/>
+          <w:color w:val="FF0000"/>
+          <w:sz w:val="24"/>
+        </w:rPr>
+      </w:pPr>
+      <w:r>
+        <w:rPr>
+          <w:rFonts w:ascii="Times New Roman" w:hAnsi="Times New Roman"/>
+          <w:i/>
+          <w:color w:val="FF0000"/>
+          <w:sz w:val="24"/>
+        </w:rPr>
+        <w:t xml:space="preserve">Тропар </w:t>
       </w:r>
     </w:p>
     <w:p>
@@ -4898,125 +4811,23 @@
       </w:r>
     </w:p>
     <w:p>
-      <w:r>
-        <w:rPr>
-          <w:rFonts w:ascii="Times New Roman" w:hAnsi="Times New Roman"/>
-          <w:i/>
-          <w:color w:val="FF0000"/>
-          <w:sz w:val="24"/>
-        </w:rPr>
-        <w:t>Кондак (г. 4):</w:t>
-      </w:r>
-      <w:r>
-        <w:rPr>
-          <w:rFonts w:ascii="Times New Roman" w:hAnsi="Times New Roman"/>
-          <w:color w:val="000000"/>
-          <w:sz w:val="24"/>
-        </w:rPr>
-        <w:t xml:space="preserve"> В стражданні твоїм подвизавшись добре</w:t>
-      </w:r>
-      <w:r>
-        <w:rPr>
-          <w:rFonts w:ascii="Times New Roman" w:hAnsi="Times New Roman"/>
-          <w:sz w:val="24"/>
-          <w:highlight w:val="white"/>
-        </w:rPr>
-        <w:t>*</w:t>
-      </w:r>
-      <w:r>
-        <w:rPr>
-          <w:rFonts w:ascii="Times New Roman" w:hAnsi="Times New Roman"/>
-          <w:color w:val="000000"/>
-          <w:sz w:val="24"/>
-        </w:rPr>
-        <w:t xml:space="preserve"> і по смерти освячуєш чудес потоками, всехвальна,</w:t>
-      </w:r>
-      <w:r>
-        <w:rPr>
-          <w:rFonts w:ascii="Times New Roman" w:hAnsi="Times New Roman"/>
-          <w:sz w:val="24"/>
-          <w:highlight w:val="white"/>
-        </w:rPr>
-        <w:t>*</w:t>
-      </w:r>
-      <w:r>
-        <w:rPr>
-          <w:rFonts w:ascii="Times New Roman" w:hAnsi="Times New Roman"/>
-          <w:color w:val="000000"/>
-          <w:sz w:val="24"/>
-        </w:rPr>
-        <w:t xml:space="preserve"> нас, </w:t>
-      </w:r>
-      <w:r>
-        <w:rPr>
-          <w:rFonts w:ascii="Times New Roman" w:hAnsi="Times New Roman"/>
-          <w:sz w:val="24"/>
-        </w:rPr>
-        <w:t>що</w:t>
-      </w:r>
-      <w:r>
-        <w:rPr>
-          <w:rFonts w:ascii="Times New Roman" w:hAnsi="Times New Roman"/>
-          <w:color w:val="000000"/>
-          <w:sz w:val="24"/>
-        </w:rPr>
-        <w:t xml:space="preserve"> з вірою прибігаємо в божественну церкву твою.</w:t>
-      </w:r>
-      <w:r>
-        <w:rPr>
-          <w:rFonts w:ascii="Times New Roman" w:hAnsi="Times New Roman"/>
-          <w:sz w:val="24"/>
-          <w:highlight w:val="white"/>
-        </w:rPr>
-        <w:t>*</w:t>
-      </w:r>
-      <w:r>
-        <w:rPr>
-          <w:rFonts w:ascii="Times New Roman" w:hAnsi="Times New Roman"/>
-          <w:color w:val="000000"/>
-          <w:sz w:val="24"/>
-        </w:rPr>
-        <w:t xml:space="preserve"> Тому, святкуючи, молимо тебе, преподобна мученице Євдокіє,</w:t>
-      </w:r>
-      <w:r>
-        <w:rPr>
-          <w:rFonts w:ascii="Times New Roman" w:hAnsi="Times New Roman"/>
-          <w:sz w:val="24"/>
-          <w:highlight w:val="white"/>
-        </w:rPr>
-        <w:t>*</w:t>
-      </w:r>
-      <w:r>
-        <w:rPr>
-          <w:rFonts w:ascii="Times New Roman" w:hAnsi="Times New Roman"/>
-          <w:color w:val="000000"/>
-          <w:sz w:val="24"/>
-        </w:rPr>
-        <w:t xml:space="preserve"> щоб ізбавитись нам від н</w:t>
-      </w:r>
-      <w:r>
-        <w:rPr>
-          <w:rFonts w:ascii="Times New Roman" w:hAnsi="Times New Roman"/>
-          <w:color w:val="000000"/>
-          <w:sz w:val="24"/>
-        </w:rPr>
-        <w:t>едуг душевних</w:t>
-      </w:r>
-      <w:r>
-        <w:rPr>
-          <w:rFonts w:ascii="Times New Roman" w:hAnsi="Times New Roman"/>
-          <w:sz w:val="24"/>
-          <w:highlight w:val="white"/>
-        </w:rPr>
-        <w:t>*</w:t>
-      </w:r>
-      <w:r>
-        <w:rPr>
-          <w:rFonts w:ascii="Times New Roman" w:hAnsi="Times New Roman"/>
-          <w:color w:val="000000"/>
-          <w:sz w:val="24"/>
-        </w:rPr>
-        <w:t xml:space="preserve"> і почерпнути чудес благодать.</w:t>
+      <w:pPr>
+        <w:spacing w:line="240" w:lineRule="auto"/>
+        <w:rPr>
+          <w:rFonts w:ascii="Times New Roman" w:hAnsi="Times New Roman"/>
+          <w:i/>
+          <w:color w:val="FF0000"/>
+          <w:sz w:val="24"/>
+        </w:rPr>
+      </w:pPr>
+      <w:r>
+        <w:rPr>
+          <w:rFonts w:ascii="Times New Roman" w:hAnsi="Times New Roman"/>
+          <w:i/>
+          <w:color w:val="FF0000"/>
+          <w:sz w:val="24"/>
+        </w:rPr>
+        <w:t xml:space="preserve">Кондак </w:t>
       </w:r>
     </w:p>
     <w:p>
@@ -10181,110 +9992,23 @@
       </w:r>
     </w:p>
     <w:p>
-      <w:r>
-        <w:rPr>
-          <w:rFonts w:ascii="Times New Roman" w:hAnsi="Times New Roman"/>
-          <w:i/>
-          <w:color w:val="FF0000"/>
-          <w:sz w:val="24"/>
-        </w:rPr>
-        <w:t>Тропар (г. 8):</w:t>
-      </w:r>
-      <w:r>
-        <w:rPr>
-          <w:rFonts w:ascii="Times New Roman" w:hAnsi="Times New Roman"/>
-          <w:color w:val="000000"/>
-          <w:sz w:val="24"/>
-        </w:rPr>
-        <w:t xml:space="preserve"> Правильністю розумною душу твою прив’язала єси до любові Христової,</w:t>
-      </w:r>
-      <w:r>
-        <w:rPr>
-          <w:rFonts w:ascii="Times New Roman" w:hAnsi="Times New Roman"/>
-          <w:sz w:val="24"/>
-          <w:highlight w:val="white"/>
-        </w:rPr>
-        <w:t>*</w:t>
-      </w:r>
-      <w:r>
-        <w:rPr>
-          <w:rFonts w:ascii="Times New Roman" w:hAnsi="Times New Roman"/>
-          <w:color w:val="000000"/>
-          <w:sz w:val="24"/>
-        </w:rPr>
-        <w:t xml:space="preserve"> тлінне, гарне, дочасне забуттям пробігла єси як учениця Слова. Перше постом пристрасті умертвила,</w:t>
-      </w:r>
-      <w:r>
-        <w:rPr>
-          <w:rFonts w:ascii="Times New Roman" w:hAnsi="Times New Roman"/>
-          <w:sz w:val="24"/>
-          <w:highlight w:val="white"/>
-        </w:rPr>
-        <w:t>*</w:t>
-      </w:r>
-      <w:r>
-        <w:rPr>
-          <w:rFonts w:ascii="Times New Roman" w:hAnsi="Times New Roman"/>
-          <w:color w:val="000000"/>
-          <w:sz w:val="24"/>
-        </w:rPr>
-        <w:t xml:space="preserve"> а відтак стражданням ворога осоромила,</w:t>
-      </w:r>
-      <w:r>
-        <w:rPr>
-          <w:rFonts w:ascii="Times New Roman" w:hAnsi="Times New Roman"/>
-          <w:sz w:val="24"/>
-          <w:highlight w:val="white"/>
-        </w:rPr>
-        <w:t>*</w:t>
-      </w:r>
-      <w:r>
-        <w:rPr>
-          <w:rFonts w:ascii="Times New Roman" w:hAnsi="Times New Roman"/>
-          <w:color w:val="000000"/>
-          <w:sz w:val="24"/>
-        </w:rPr>
-        <w:t xml:space="preserve"> тому Христос подвійних вінців сподобив тебе,</w:t>
-      </w:r>
-      <w:r>
-        <w:rPr>
-          <w:rFonts w:ascii="Times New Roman" w:hAnsi="Times New Roman"/>
-          <w:sz w:val="24"/>
-          <w:highlight w:val="white"/>
-        </w:rPr>
-        <w:t>*</w:t>
-      </w:r>
-      <w:r>
-        <w:rPr>
-          <w:rFonts w:ascii="Times New Roman" w:hAnsi="Times New Roman"/>
-          <w:color w:val="000000"/>
-          <w:sz w:val="24"/>
-        </w:rPr>
-        <w:t xml:space="preserve"> Євдокіє славна, страстотерпице преподобна,</w:t>
-      </w:r>
-      <w:r>
-        <w:rPr>
-          <w:rFonts w:ascii="Times New Roman" w:hAnsi="Times New Roman"/>
-          <w:sz w:val="24"/>
-          <w:highlight w:val="white"/>
-        </w:rPr>
-        <w:t>*</w:t>
-      </w:r>
-      <w:r>
-        <w:rPr>
-          <w:rFonts w:ascii="Times New Roman" w:hAnsi="Times New Roman"/>
-          <w:color w:val="000000"/>
-          <w:sz w:val="24"/>
-        </w:rPr>
-        <w:t xml:space="preserve"> моли ж Христа, щоб спаслис</w:t>
-      </w:r>
-      <w:r>
-        <w:rPr>
-          <w:rFonts w:ascii="Times New Roman" w:hAnsi="Times New Roman"/>
-          <w:color w:val="000000"/>
-          <w:sz w:val="24"/>
-        </w:rPr>
-        <w:t>ь душі наші.</w:t>
+      <w:pPr>
+        <w:spacing w:line="240" w:lineRule="auto"/>
+        <w:rPr>
+          <w:rFonts w:ascii="Times New Roman" w:hAnsi="Times New Roman"/>
+          <w:i/>
+          <w:color w:val="FF0000"/>
+          <w:sz w:val="24"/>
+        </w:rPr>
+      </w:pPr>
+      <w:r>
+        <w:rPr>
+          <w:rFonts w:ascii="Times New Roman" w:hAnsi="Times New Roman"/>
+          <w:i/>
+          <w:color w:val="FF0000"/>
+          <w:sz w:val="24"/>
+        </w:rPr>
+        <w:t xml:space="preserve">Тропар </w:t>
       </w:r>
     </w:p>
     <w:p>
@@ -10741,125 +10465,23 @@
       </w:r>
     </w:p>
     <w:p>
-      <w:r>
-        <w:rPr>
-          <w:rFonts w:ascii="Times New Roman" w:hAnsi="Times New Roman"/>
-          <w:i/>
-          <w:color w:val="FF0000"/>
-          <w:sz w:val="24"/>
-        </w:rPr>
-        <w:t>Кондак (г. 4):</w:t>
-      </w:r>
-      <w:r>
-        <w:rPr>
-          <w:rFonts w:ascii="Times New Roman" w:hAnsi="Times New Roman"/>
-          <w:color w:val="000000"/>
-          <w:sz w:val="24"/>
-        </w:rPr>
-        <w:t xml:space="preserve"> В стражданні твоїм подвизавшись добре</w:t>
-      </w:r>
-      <w:r>
-        <w:rPr>
-          <w:rFonts w:ascii="Times New Roman" w:hAnsi="Times New Roman"/>
-          <w:sz w:val="24"/>
-          <w:highlight w:val="white"/>
-        </w:rPr>
-        <w:t>*</w:t>
-      </w:r>
-      <w:r>
-        <w:rPr>
-          <w:rFonts w:ascii="Times New Roman" w:hAnsi="Times New Roman"/>
-          <w:color w:val="000000"/>
-          <w:sz w:val="24"/>
-        </w:rPr>
-        <w:t xml:space="preserve"> і по смерти освячуєш чудес потоками, всехвальна,</w:t>
-      </w:r>
-      <w:r>
-        <w:rPr>
-          <w:rFonts w:ascii="Times New Roman" w:hAnsi="Times New Roman"/>
-          <w:sz w:val="24"/>
-          <w:highlight w:val="white"/>
-        </w:rPr>
-        <w:t>*</w:t>
-      </w:r>
-      <w:r>
-        <w:rPr>
-          <w:rFonts w:ascii="Times New Roman" w:hAnsi="Times New Roman"/>
-          <w:color w:val="000000"/>
-          <w:sz w:val="24"/>
-        </w:rPr>
-        <w:t xml:space="preserve"> нас, </w:t>
-      </w:r>
-      <w:r>
-        <w:rPr>
-          <w:rFonts w:ascii="Times New Roman" w:hAnsi="Times New Roman"/>
-          <w:sz w:val="24"/>
-        </w:rPr>
-        <w:t>що</w:t>
-      </w:r>
-      <w:r>
-        <w:rPr>
-          <w:rFonts w:ascii="Times New Roman" w:hAnsi="Times New Roman"/>
-          <w:color w:val="000000"/>
-          <w:sz w:val="24"/>
-        </w:rPr>
-        <w:t xml:space="preserve"> з вірою прибігаємо в божественну церкву твою.</w:t>
-      </w:r>
-      <w:r>
-        <w:rPr>
-          <w:rFonts w:ascii="Times New Roman" w:hAnsi="Times New Roman"/>
-          <w:sz w:val="24"/>
-          <w:highlight w:val="white"/>
-        </w:rPr>
-        <w:t>*</w:t>
-      </w:r>
-      <w:r>
-        <w:rPr>
-          <w:rFonts w:ascii="Times New Roman" w:hAnsi="Times New Roman"/>
-          <w:color w:val="000000"/>
-          <w:sz w:val="24"/>
-        </w:rPr>
-        <w:t xml:space="preserve"> Тому, святкуючи, молимо тебе, преподобна мученице Євдокіє,</w:t>
-      </w:r>
-      <w:r>
-        <w:rPr>
-          <w:rFonts w:ascii="Times New Roman" w:hAnsi="Times New Roman"/>
-          <w:sz w:val="24"/>
-          <w:highlight w:val="white"/>
-        </w:rPr>
-        <w:t>*</w:t>
-      </w:r>
-      <w:r>
-        <w:rPr>
-          <w:rFonts w:ascii="Times New Roman" w:hAnsi="Times New Roman"/>
-          <w:color w:val="000000"/>
-          <w:sz w:val="24"/>
-        </w:rPr>
-        <w:t xml:space="preserve"> щоб ізбавитись нам від н</w:t>
-      </w:r>
-      <w:r>
-        <w:rPr>
-          <w:rFonts w:ascii="Times New Roman" w:hAnsi="Times New Roman"/>
-          <w:color w:val="000000"/>
-          <w:sz w:val="24"/>
-        </w:rPr>
-        <w:t>едуг душевних</w:t>
-      </w:r>
-      <w:r>
-        <w:rPr>
-          <w:rFonts w:ascii="Times New Roman" w:hAnsi="Times New Roman"/>
-          <w:sz w:val="24"/>
-          <w:highlight w:val="white"/>
-        </w:rPr>
-        <w:t>*</w:t>
-      </w:r>
-      <w:r>
-        <w:rPr>
-          <w:rFonts w:ascii="Times New Roman" w:hAnsi="Times New Roman"/>
-          <w:color w:val="000000"/>
-          <w:sz w:val="24"/>
-        </w:rPr>
-        <w:t xml:space="preserve"> і почерпнути чудес благодать.</w:t>
+      <w:pPr>
+        <w:spacing w:line="240" w:lineRule="auto"/>
+        <w:rPr>
+          <w:rFonts w:ascii="Times New Roman" w:hAnsi="Times New Roman"/>
+          <w:i/>
+          <w:color w:val="FF0000"/>
+          <w:sz w:val="24"/>
+        </w:rPr>
+      </w:pPr>
+      <w:r>
+        <w:rPr>
+          <w:rFonts w:ascii="Times New Roman" w:hAnsi="Times New Roman"/>
+          <w:i/>
+          <w:color w:val="FF0000"/>
+          <w:sz w:val="24"/>
+        </w:rPr>
+        <w:t xml:space="preserve">Кондак </w:t>
       </w:r>
     </w:p>
     <w:p>

</xml_diff>